<commit_message>
Update all docs to reflect current website: Prisma/SQLite, custom CSS, new pages (team, admin), updated copy and navigation
Co-authored-by: Kayo2970 <66328031+Kayo2970@users.noreply.github.com>
Agent-Logs-Url: https://github.com/Kayo2970/leads-website/sessions/b9c3046d-6153-4bfc-a89a-4377ee0b9511
</commit_message>
<xml_diff>
--- a/docs/content/Content-LEADS.docx
+++ b/docs/content/Content-LEADS.docx
@@ -26,7 +26,7 @@
         <w:jc w:val="center"/>
       </w:pPr>
       <w:r>
-        <w:t xml:space="preserve">MSRUAS – 2026</w:t>
+        <w:t>MSRUAS – 2026 (Updated: 2026-03-24)</w:t>
       </w:r>
     </w:p>
     <w:p/>
@@ -95,7 +95,7 @@
         <w:spacing w:after="80"/>
       </w:pPr>
       <w:r>
-        <w:t xml:space="preserve">5. Join Us Page (/join)</w:t>
+        <w:t>5. Join Page (/join)</w:t>
       </w:r>
     </w:p>
     <w:p>
@@ -103,7 +103,9 @@
         <w:spacing w:after="240"/>
       </w:pPr>
       <w:r>
-        <w:t xml:space="preserve">6. Contact Page (/contact)</w:t>
+        <w:t>6. Contact Page (/contact)</w:t>
+        <w:br/>
+        <w:t>7. Team Page (/team) [NEW]</w:t>
       </w:r>
     </w:p>
     <w:p>
@@ -207,7 +209,7 @@
         <w:spacing w:after="240" w:before="120"/>
       </w:pPr>
       <w:r>
-        <w:t xml:space="preserve">Build the Leadership India Needs. Starting Now.</w:t>
+        <w:t>Where Leaders Are Made.</w:t>
       </w:r>
     </w:p>
     <w:p>
@@ -224,7 +226,7 @@
         <w:spacing w:after="240" w:line="360"/>
       </w:pPr>
       <w:r>
-        <w:t xml:space="preserve">LEADS Next Gen Centre is where MSRUAS students gain real industry skills, sustainability leadership, and career-defining connections — starting in their first year.</w:t>
+        <w:t>LEADS Next Gen Centre shapes students into communicators, entrepreneurs, and change-makers through real-world programmes, industry mentorship, and India's premier leadership summit. "Empowering visions, engineering the future, inspiring minds."</w:t>
       </w:r>
     </w:p>
     <w:p>
@@ -241,7 +243,7 @@
         <w:spacing w:after="240" w:line="360"/>
       </w:pPr>
       <w:r>
-        <w:t xml:space="preserve">Explore Our Programs</w:t>
+        <w:t>Explore LEADS</w:t>
       </w:r>
     </w:p>
     <w:p>
@@ -258,7 +260,7 @@
         <w:spacing w:after="240" w:line="360"/>
       </w:pPr>
       <w:r>
-        <w:t xml:space="preserve">Register for BLS 2026</w:t>
+        <w:t>Join the Movement →</w:t>
       </w:r>
     </w:p>
     <w:p>
@@ -390,7 +392,7 @@
         <w:spacing w:after="240" w:line="360"/>
       </w:pPr>
       <w:r>
-        <w:t xml:space="preserve">Bharat Lead Summit is LEADS's flagship event—a national platform bringing together 1,500+ student leaders, professionals, and changemakers. This year's theme: "Sustainable Leadership &amp; AI 2026." Whether you're a delegate, speaker, or volunteer, BLS is where you meet the next generation of impact-makers and stay ahead of where India's opportunities are heading.</w:t>
+        <w:t>Bharat Lead Summit is LEADS's flagship event—a national platform bringing together 1,500+ student leaders, professionals, and changemakers. This year's theme: "Sustainable Leadership &amp; AI." Whether you're a delegate, speaker, or volunteer, BLS is where you meet the next generation of impact-makers and stay ahead of where India's opportunities are heading.</w:t>
       </w:r>
     </w:p>
     <w:p>
@@ -440,7 +442,7 @@
         <w:spacing w:after="240" w:line="360"/>
       </w:pPr>
       <w:r>
-        <w:t xml:space="preserve">Ready to lead? Join LEADS.</w:t>
+        <w:t>Ready to Lead? Apply to LEADS →</w:t>
       </w:r>
     </w:p>
     <w:r>
@@ -555,7 +557,7 @@
         <w:spacing w:after="240" w:before="120"/>
       </w:pPr>
       <w:r>
-        <w:t xml:space="preserve">Where Leaders Are Built, Not Born</w:t>
+        <w:t>Inspiring Future-Ready Youth Leaders</w:t>
       </w:r>
     </w:p>
     <w:p>
@@ -910,7 +912,7 @@
         <w:spacing w:after="240" w:line="360"/>
       </w:pPr>
       <w:r>
-        <w:t xml:space="preserve">Register for the Next Event</w:t>
+        <w:t>Join the Movement →</w:t>
       </w:r>
     </w:p>
     <w:r>
@@ -989,7 +991,7 @@
         <w:spacing w:after="240" w:before="120"/>
       </w:pPr>
       <w:r>
-        <w:t xml:space="preserve">The Stage for Sustainable Leadership</w:t>
+        <w:t>Bharat Lead Summit 2026</w:t>
       </w:r>
     </w:p>
     <w:p>
@@ -1205,7 +1207,7 @@
         <w:spacing w:after="240" w:line="360"/>
       </w:pPr>
       <w:r>
-        <w:t xml:space="preserve">Register as a Delegate</w:t>
+        <w:t>Register for BLS 2026 →</w:t>
       </w:r>
     </w:p>
     <w:r>
@@ -1284,7 +1286,7 @@
         <w:spacing w:after="240" w:before="120"/>
       </w:pPr>
       <w:r>
-        <w:t xml:space="preserve">Your Leadership Journey Starts Here</w:t>
+        <w:t>Ready to Lead?</w:t>
       </w:r>
     </w:p>
     <w:p>
@@ -1400,7 +1402,7 @@
         <w:spacing w:after="240" w:line="360"/>
       </w:pPr>
       <w:r>
-        <w:t xml:space="preserve">We typically recruit Trainee Associates in September and January (start of academic years). If you're a second-year or beyond student and passionate about leadership, sustainability, or community building, we also look for mentors and event leads year-round. The best time to join is when you're ready. The best way to apply is to reach out directly—either email leads.msruas@msruas.ac.in or attend a LEADS event to connect with current leaders.</w:t>
+        <w:t>We typically recruit Trainee Associates in September and January (start of academic years). If you're a second-year or beyond student and passionate about leadership, sustainability, or community building, we also look for mentors and event leads year-round. The best time to join is when you're ready. The best way to apply is to reach out directly—either email leads.ngc@msruas.ac.in or attend a LEADS event to connect with current leaders.</w:t>
       </w:r>
     </w:p>
     <w:p>
@@ -1450,7 +1452,7 @@
         <w:spacing w:after="240" w:line="360"/>
       </w:pPr>
       <w:r>
-        <w:t xml:space="preserve">Apply to Join LEADS</w:t>
+        <w:t>Apply to LEADS →</w:t>
       </w:r>
     </w:p>
     <w:r>
@@ -1529,7 +1531,7 @@
         <w:spacing w:after="240" w:before="120"/>
       </w:pPr>
       <w:r>
-        <w:t xml:space="preserve">Get in Touch with LEADS</w:t>
+        <w:t>Get in Touch</w:t>
       </w:r>
     </w:p>
     <w:p>
@@ -1563,23 +1565,23 @@
         <w:spacing w:after="240" w:line="360"/>
       </w:pPr>
       <w:r>
-        <w:t xml:space="preserve">Email: leads.msruas@msruas.ac.in</w:t>
-      </w:r>
-    </w:p>
-    <w:p>
-      <w:pPr>
-        <w:spacing w:after="240" w:line="360"/>
-      </w:pPr>
-      <w:r>
-        <w:t xml:space="preserve">Phone: +91 8910332851 | +91 8045386666 Ext 793</w:t>
-      </w:r>
-    </w:p>
-    <w:p>
-      <w:pPr>
-        <w:spacing w:after="240" w:line="360"/>
-      </w:pPr>
-      <w:r>
-        <w:t xml:space="preserve">Address: LEADS Next Gen Centre, Faculty of Management &amp; Commerce, MSRUAS, Gnanagangothri Campus, New BEL Road, MSR Nagar, Bengaluru – 560054, India</w:t>
+        <w:t>Email: leads.ngc@msruas.ac.in</w:t>
+      </w:r>
+    </w:p>
+    <w:p>
+      <w:pPr>
+        <w:spacing w:after="240" w:line="360"/>
+      </w:pPr>
+      <w:r>
+        <w:t>Phone: +91 91106 73919 | +91 80183 75553 | +91 78992 93097</w:t>
+      </w:r>
+    </w:p>
+    <w:p>
+      <w:pPr>
+        <w:spacing w:after="240" w:line="360"/>
+      </w:pPr>
+      <w:r>
+        <w:t>Address: University House, New BEL Rd, M S R Nagar, Mathikere, Bengaluru, Karnataka 560054</w:t>
       </w:r>
     </w:p>
     <w:p>
@@ -1851,7 +1853,7 @@
         <w:spacing w:after="240" w:line="360"/>
       </w:pPr>
       <w:r>
-        <w:t xml:space="preserve">BLS is where India's emerging leaders meet. If you're serious about making an impact, you need to be there.</w:t>
+        <w:t>BLS 2026 is where India's emerging leaders meet. Theme: Sustainable Leadership &amp; AI. If you're serious about making an impact, you need to be there.</w:t>
       </w:r>
     </w:p>
     <w:p>
@@ -2080,23 +2082,23 @@
         <w:spacing w:after="240" w:line="360"/>
       </w:pPr>
       <w:r>
-        <w:t xml:space="preserve">Email: leads.msruas@msruas.ac.in</w:t>
-      </w:r>
-    </w:p>
-    <w:p>
-      <w:pPr>
-        <w:spacing w:after="240" w:line="360"/>
-      </w:pPr>
-      <w:r>
-        <w:t xml:space="preserve">Phone: +91 8910332851 | +91 8045386666 Ext 793</w:t>
-      </w:r>
-    </w:p>
-    <w:p>
-      <w:pPr>
-        <w:spacing w:after="240" w:line="360"/>
-      </w:pPr>
-      <w:r>
-        <w:t xml:space="preserve">Address: LEADS Next Gen Centre, Faculty of Management &amp; Commerce, MSRUAS, Gnanagangothri Campus, New BEL Road, MSR Nagar, Bengaluru – 560054, India</w:t>
+        <w:t>Email: leads.ngc@msruas.ac.in</w:t>
+      </w:r>
+    </w:p>
+    <w:p>
+      <w:pPr>
+        <w:spacing w:after="240" w:line="360"/>
+      </w:pPr>
+      <w:r>
+        <w:t>Phone: +91 91106 73919 | +91 80183 75553 | +91 78992 93097</w:t>
+      </w:r>
+    </w:p>
+    <w:p>
+      <w:pPr>
+        <w:spacing w:after="240" w:line="360"/>
+      </w:pPr>
+      <w:r>
+        <w:t>Address: University House, New BEL Rd, M S R Nagar, Mathikere, Bengaluru, Karnataka 560054</w:t>
       </w:r>
     </w:p>
     <w:p>

</xml_diff>